<commit_message>
Security review: rate-limit public calendar, clamp month range, harden widget
- Add rate limiting to /public/calendar - it was the only anonymous endpoint missing it (the JSON
  API already had it).
- Clamp the ?month= parameter to a year back / two years forward. Unclamped, DateTime.TryParse
  accepted ~120k distinct month values, and every unseen month was a cache miss fanning out live
  Graph calls across every mailbox plus a permanently-cached entry - an anonymous Graph-quota-
  exhaustion and unbounded cache-growth vector.
- Harden availability-widget.js to build sheet-slot rows via textContent/createElement instead of
  innerHTML string interpolation, matching the club-event rows' existing pattern. Not exploitable
  today (sheetLabel is admin-config-derived, not staff input), but that script runs on the club's
  own website, so it was one config change away from stored XSS there.

Co-Authored-By: Claude Sonnet 5 <noreply@anthropic.com>
</commit_message>
<xml_diff>
--- a/docs/curling-facility-scheduling-architecture.docx
+++ b/docs/curling-facility-scheduling-architecture.docx
@@ -4742,7 +4742,27 @@
         <w:t xml:space="preserve">/public/calendar</w:t>
       </w:r>
       <w:r>
-        <w:t xml:space="preserve">) — the *primary* way club members see what's going on club-wide while unauthenticated. Shows every category and state, with titles (a league's own name, a renter's own chosen title) — not just rental-availability slots. The one deliberate privacy exception: a confirmed rental's actual renter name is not stripped programmatically; staff are expected to handle that via what they type into the title field, not the app. Chips are clickable, opening a small popup with the exact time (the month-grid itself doesn't show hour-level detail). Iframe-embeddable; currently has </w:t>
+        <w:t xml:space="preserve">) — the *primary* way club members see what's going on club-wide while unauthenticated. Shares the JSON API's rate-limit policy, and clamps its </w:t>
+      </w:r>
+      <w:r>
+        <w:rPr>
+          <w:rFonts w:ascii="Consolas" w:cs="Consolas" w:eastAsia="Consolas" w:hAnsi="Consolas"/>
+          <w:shd w:fill="F0F0F0" w:val="clear"/>
+        </w:rPr>
+        <w:t xml:space="preserve">?month=</w:t>
+      </w:r>
+      <w:r>
+        <w:t xml:space="preserve"> parameter to a bounded window around today (a year back, two years forward) — unclamped, </w:t>
+      </w:r>
+      <w:r>
+        <w:rPr>
+          <w:rFonts w:ascii="Consolas" w:cs="Consolas" w:eastAsia="Consolas" w:hAnsi="Consolas"/>
+          <w:shd w:fill="F0F0F0" w:val="clear"/>
+        </w:rPr>
+        <w:t xml:space="preserve">DateTime.TryParse</w:t>
+      </w:r>
+      <w:r>
+        <w:t xml:space="preserve"> accepts ~120k distinct months, and every unseen month is a cache miss fanning out live Graph calls across every mailbox, an anonymous quota-exhaustion/cache-growth vector (found and closed in the Phase 10 security review). Shows every category and state, with titles (a league's own name, a renter's own chosen title) — not just rental-availability slots. The one deliberate privacy exception: a confirmed rental's actual renter name is not stripped programmatically; staff are expected to handle that via what they type into the title field, not the app. Chips are clickable, opening a small popup with the exact time (the month-grid itself doesn't show hour-level detail). Iframe-embeddable; currently has </w:t>
       </w:r>
       <w:r>
         <w:rPr>
@@ -5355,7 +5375,74 @@
         <w:spacing w:after="80"/>
       </w:pPr>
       <w:r>
-        <w:t xml:space="preserve">Standard OWASP hygiene — a full security review pass is a Phase 10 follow-up item.</w:t>
+        <w:rPr>
+          <w:b/>
+          <w:bCs/>
+        </w:rPr>
+        <w:t xml:space="preserve">Phase 10 security review completed (2026-07-16).</w:t>
+      </w:r>
+      <w:r>
+        <w:t xml:space="preserve"> Confirmed sound: the auth model above, XSS encoding discipline on both public surfaces, input clamping on </w:t>
+      </w:r>
+      <w:r>
+        <w:rPr>
+          <w:rFonts w:ascii="Consolas" w:cs="Consolas" w:eastAsia="Consolas" w:hAnsi="Consolas"/>
+          <w:shd w:fill="F0F0F0" w:val="clear"/>
+        </w:rPr>
+        <w:t xml:space="preserve">?days=</w:t>
+      </w:r>
+      <w:r>
+        <w:t xml:space="preserve">, CORS scoping, secrets posture, and the uncached conflict-check invariant (D16). Found and fixed: missing rate limiting on </w:t>
+      </w:r>
+      <w:r>
+        <w:rPr>
+          <w:rFonts w:ascii="Consolas" w:cs="Consolas" w:eastAsia="Consolas" w:hAnsi="Consolas"/>
+          <w:shd w:fill="F0F0F0" w:val="clear"/>
+        </w:rPr>
+        <w:t xml:space="preserve">/public/calendar</w:t>
+      </w:r>
+      <w:r>
+        <w:t xml:space="preserve">, the unbounded </w:t>
+      </w:r>
+      <w:r>
+        <w:rPr>
+          <w:rFonts w:ascii="Consolas" w:cs="Consolas" w:eastAsia="Consolas" w:hAnsi="Consolas"/>
+          <w:shd w:fill="F0F0F0" w:val="clear"/>
+        </w:rPr>
+        <w:t xml:space="preserve">?month=</w:t>
+      </w:r>
+      <w:r>
+        <w:t xml:space="preserve"> quota-exhaustion vector (§5.4.2), and an </w:t>
+      </w:r>
+      <w:r>
+        <w:rPr>
+          <w:rFonts w:ascii="Consolas" w:cs="Consolas" w:eastAsia="Consolas" w:hAnsi="Consolas"/>
+          <w:shd w:fill="F0F0F0" w:val="clear"/>
+        </w:rPr>
+        <w:t xml:space="preserve">innerHTML</w:t>
+      </w:r>
+      <w:r>
+        <w:t xml:space="preserve"> interpolation in the embed widget (admin-config data only, hardened to </w:t>
+      </w:r>
+      <w:r>
+        <w:rPr>
+          <w:rFonts w:ascii="Consolas" w:cs="Consolas" w:eastAsia="Consolas" w:hAnsi="Consolas"/>
+          <w:shd w:fill="F0F0F0" w:val="clear"/>
+        </w:rPr>
+        <w:t xml:space="preserve">textContent</w:t>
+      </w:r>
+      <w:r>
+        <w:t xml:space="preserve"> as defense in depth since that script executes on the club's own website). Accepted with eyes open: the rate limiter is a single global 60/min bucket, not per-IP — stronger Graph-quota protection, but one abusive client can starve the widget for legitimate visitors; revisit with per-IP partitioning (plus forwarded-headers config) if real traffic warrants. </w:t>
+      </w:r>
+      <w:r>
+        <w:rPr>
+          <w:rFonts w:ascii="Consolas" w:cs="Consolas" w:eastAsia="Consolas" w:hAnsi="Consolas"/>
+          <w:shd w:fill="F0F0F0" w:val="clear"/>
+        </w:rPr>
+        <w:t xml:space="preserve">/diagnostics</w:t>
+      </w:r>
+      <w:r>
+        <w:t xml:space="preserve"> remains reachable by any signed-in staff member — remove or admin-gate before members get accounts.</w:t>
       </w:r>
     </w:p>
     <w:p>

</xml_diff>

<commit_message>
Render the architecture doc's component-overview diagram as an actual image
The docx generator previously dumped Mermaid fences as plain monospace text since Word can't
render Mermaid natively - the diagram in §3.1 showed as raw flowchart source instead of a
picture. Now rendered to a PNG (via mermaid-cli) and embedded as an image. Markdown source
was already correct; only the .docx needed regenerating.

Co-Authored-By: Claude Sonnet 5 <noreply@anthropic.com>
</commit_message>
<xml_diff>
--- a/docs/curling-facility-scheduling-architecture.docx
+++ b/docs/curling-facility-scheduling-architecture.docx
@@ -1214,498 +1214,49 @@
     </w:p>
     <w:p>
       <w:pPr>
-        <w:shd w:fill="F5F5F5" w:val="clear"/>
-        <w:spacing w:after="0"/>
-      </w:pPr>
-      <w:r>
-        <w:rPr>
-          <w:rFonts w:ascii="Consolas" w:cs="Consolas" w:eastAsia="Consolas" w:hAnsi="Consolas"/>
-          <w:sz w:val="18"/>
-          <w:szCs w:val="18"/>
-        </w:rPr>
-        <w:t xml:space="preserve">flowchart TB</w:t>
-      </w:r>
-    </w:p>
-    <w:p>
-      <w:pPr>
-        <w:shd w:fill="F5F5F5" w:val="clear"/>
-        <w:spacing w:after="0"/>
-      </w:pPr>
-      <w:r>
-        <w:rPr>
-          <w:rFonts w:ascii="Consolas" w:cs="Consolas" w:eastAsia="Consolas" w:hAnsi="Consolas"/>
-          <w:sz w:val="18"/>
-          <w:szCs w:val="18"/>
-        </w:rPr>
-        <w:t xml:space="preserve">    subgraph M365 ["Microsoft 365 Tenant (configuration-driven, §4.6)"]</w:t>
-      </w:r>
-    </w:p>
-    <w:p>
-      <w:pPr>
-        <w:shd w:fill="F5F5F5" w:val="clear"/>
-        <w:spacing w:after="0"/>
-      </w:pPr>
-      <w:r>
-        <w:rPr>
-          <w:rFonts w:ascii="Consolas" w:cs="Consolas" w:eastAsia="Consolas" w:hAnsi="Consolas"/>
-          <w:sz w:val="18"/>
-          <w:szCs w:val="18"/>
-        </w:rPr>
-        <w:t xml:space="preserve">        EID["Entra ID&lt;br/&gt;(staff SSO + app registration)"]</w:t>
-      </w:r>
-    </w:p>
-    <w:p>
-      <w:pPr>
-        <w:shd w:fill="F5F5F5" w:val="clear"/>
-        <w:spacing w:after="0"/>
-      </w:pPr>
-      <w:r>
-        <w:rPr>
-          <w:rFonts w:ascii="Consolas" w:cs="Consolas" w:eastAsia="Consolas" w:hAnsi="Consolas"/>
-          <w:sz w:val="18"/>
-          <w:szCs w:val="18"/>
-        </w:rPr>
-        <w:t xml:space="preserve">        subgraph EXO ["Exchange Online — system of record"]</w:t>
-      </w:r>
-    </w:p>
-    <w:p>
-      <w:pPr>
-        <w:shd w:fill="F5F5F5" w:val="clear"/>
-        <w:spacing w:after="0"/>
-      </w:pPr>
-      <w:r>
-        <w:rPr>
-          <w:rFonts w:ascii="Consolas" w:cs="Consolas" w:eastAsia="Consolas" w:hAnsi="Consolas"/>
-          <w:sz w:val="18"/>
-          <w:szCs w:val="18"/>
-        </w:rPr>
-        <w:t xml:space="preserve">            SN["Resource mailboxes&lt;br/&gt;Sheet 1..N (configured count)"]</w:t>
-      </w:r>
-    </w:p>
-    <w:p>
-      <w:pPr>
-        <w:shd w:fill="F5F5F5" w:val="clear"/>
-        <w:spacing w:after="0"/>
-      </w:pPr>
-      <w:r>
-        <w:rPr>
-          <w:rFonts w:ascii="Consolas" w:cs="Consolas" w:eastAsia="Consolas" w:hAnsi="Consolas"/>
-          <w:sz w:val="18"/>
-          <w:szCs w:val="18"/>
-        </w:rPr>
-        <w:t xml:space="preserve">            CE["Resource mailbox&lt;br/&gt;Club Events"]</w:t>
-      </w:r>
-    </w:p>
-    <w:p>
-      <w:pPr>
-        <w:shd w:fill="F5F5F5" w:val="clear"/>
-        <w:spacing w:after="0"/>
-      </w:pPr>
-      <w:r>
-        <w:rPr>
-          <w:rFonts w:ascii="Consolas" w:cs="Consolas" w:eastAsia="Consolas" w:hAnsi="Consolas"/>
-          <w:sz w:val="18"/>
-          <w:szCs w:val="18"/>
-        </w:rPr>
-        <w:t xml:space="preserve">        end</w:t>
-      </w:r>
-    </w:p>
-    <w:p>
-      <w:pPr>
-        <w:shd w:fill="F5F5F5" w:val="clear"/>
-        <w:spacing w:after="0"/>
-      </w:pPr>
-      <w:r>
-        <w:rPr>
-          <w:rFonts w:ascii="Consolas" w:cs="Consolas" w:eastAsia="Consolas" w:hAnsi="Consolas"/>
-          <w:sz w:val="18"/>
-          <w:szCs w:val="18"/>
-        </w:rPr>
-        <w:t xml:space="preserve">    end</w:t>
-      </w:r>
-    </w:p>
-    <w:p>
-      <w:pPr>
-        <w:shd w:fill="F5F5F5" w:val="clear"/>
-        <w:spacing w:after="0"/>
-      </w:pPr>
-      <w:r>
-        <w:rPr>
-          <w:rFonts w:ascii="Consolas" w:cs="Consolas" w:eastAsia="Consolas" w:hAnsi="Consolas"/>
-          <w:sz w:val="18"/>
-          <w:szCs w:val="18"/>
-        </w:rPr>
-        <w:t xml:space="preserve"> </w:t>
-      </w:r>
-    </w:p>
-    <w:p>
-      <w:pPr>
-        <w:shd w:fill="F5F5F5" w:val="clear"/>
-        <w:spacing w:after="0"/>
-      </w:pPr>
-      <w:r>
-        <w:rPr>
-          <w:rFonts w:ascii="Consolas" w:cs="Consolas" w:eastAsia="Consolas" w:hAnsi="Consolas"/>
-          <w:sz w:val="18"/>
-          <w:szCs w:val="18"/>
-        </w:rPr>
-        <w:t xml:space="preserve">    subgraph App ["Blazor Server Application (single deployment)"]</w:t>
-      </w:r>
-    </w:p>
-    <w:p>
-      <w:pPr>
-        <w:shd w:fill="F5F5F5" w:val="clear"/>
-        <w:spacing w:after="0"/>
-      </w:pPr>
-      <w:r>
-        <w:rPr>
-          <w:rFonts w:ascii="Consolas" w:cs="Consolas" w:eastAsia="Consolas" w:hAnsi="Consolas"/>
-          <w:sz w:val="18"/>
-          <w:szCs w:val="18"/>
-        </w:rPr>
-        <w:t xml:space="preserve">        UI["Staff calendar UI&lt;br/&gt;(Month/Week/Day, series wizard,&lt;br/&gt;Club Events, filters)"]</w:t>
-      </w:r>
-    </w:p>
-    <w:p>
-      <w:pPr>
-        <w:shd w:fill="F5F5F5" w:val="clear"/>
-        <w:spacing w:after="0"/>
-      </w:pPr>
-      <w:r>
-        <w:rPr>
-          <w:rFonts w:ascii="Consolas" w:cs="Consolas" w:eastAsia="Consolas" w:hAnsi="Consolas"/>
-          <w:sz w:val="18"/>
-          <w:szCs w:val="18"/>
-        </w:rPr>
-        <w:t xml:space="preserve">        API["Services&lt;br/&gt;SheetBookingService · ClubEventService&lt;br/&gt;conflict enforcement · FacilityConfiguration"]</w:t>
-      </w:r>
-    </w:p>
-    <w:p>
-      <w:pPr>
-        <w:shd w:fill="F5F5F5" w:val="clear"/>
-        <w:spacing w:after="0"/>
-      </w:pPr>
-      <w:r>
-        <w:rPr>
-          <w:rFonts w:ascii="Consolas" w:cs="Consolas" w:eastAsia="Consolas" w:hAnsi="Consolas"/>
-          <w:sz w:val="18"/>
-          <w:szCs w:val="18"/>
-        </w:rPr>
-        <w:t xml:space="preserve">        CACHE["Ephemeral cache (IMemoryCache)&lt;br/&gt;view-reads only, 30s TTL&lt;br/&gt;never the conflict-check path"]</w:t>
-      </w:r>
-    </w:p>
-    <w:p>
-      <w:pPr>
-        <w:shd w:fill="F5F5F5" w:val="clear"/>
-        <w:spacing w:after="0"/>
-      </w:pPr>
-      <w:r>
-        <w:rPr>
-          <w:rFonts w:ascii="Consolas" w:cs="Consolas" w:eastAsia="Consolas" w:hAnsi="Consolas"/>
-          <w:sz w:val="18"/>
-          <w:szCs w:val="18"/>
-        </w:rPr>
-        <w:t xml:space="preserve">        PUBAPI["Public JSON endpoint&lt;br/&gt;+ embed widget JS"]</w:t>
-      </w:r>
-    </w:p>
-    <w:p>
-      <w:pPr>
-        <w:shd w:fill="F5F5F5" w:val="clear"/>
-        <w:spacing w:after="0"/>
-      </w:pPr>
-      <w:r>
-        <w:rPr>
-          <w:rFonts w:ascii="Consolas" w:cs="Consolas" w:eastAsia="Consolas" w:hAnsi="Consolas"/>
-          <w:sz w:val="18"/>
-          <w:szCs w:val="18"/>
-        </w:rPr>
-        <w:t xml:space="preserve">        PUBCAL["Public calendar endpoint&lt;br/&gt;(plain Minimal API, no Blazor circuit)"]</w:t>
-      </w:r>
-    </w:p>
-    <w:p>
-      <w:pPr>
-        <w:shd w:fill="F5F5F5" w:val="clear"/>
-        <w:spacing w:after="0"/>
-      </w:pPr>
-      <w:r>
-        <w:rPr>
-          <w:rFonts w:ascii="Consolas" w:cs="Consolas" w:eastAsia="Consolas" w:hAnsi="Consolas"/>
-          <w:sz w:val="18"/>
-          <w:szCs w:val="18"/>
-        </w:rPr>
-        <w:t xml:space="preserve">    end</w:t>
-      </w:r>
-    </w:p>
-    <w:p>
-      <w:pPr>
-        <w:shd w:fill="F5F5F5" w:val="clear"/>
-        <w:spacing w:after="0"/>
-      </w:pPr>
-      <w:r>
-        <w:rPr>
-          <w:rFonts w:ascii="Consolas" w:cs="Consolas" w:eastAsia="Consolas" w:hAnsi="Consolas"/>
-          <w:sz w:val="18"/>
-          <w:szCs w:val="18"/>
-        </w:rPr>
-        <w:t xml:space="preserve"> </w:t>
-      </w:r>
-    </w:p>
-    <w:p>
-      <w:pPr>
-        <w:shd w:fill="F5F5F5" w:val="clear"/>
-        <w:spacing w:after="0"/>
-      </w:pPr>
-      <w:r>
-        <w:rPr>
-          <w:rFonts w:ascii="Consolas" w:cs="Consolas" w:eastAsia="Consolas" w:hAnsi="Consolas"/>
-          <w:sz w:val="18"/>
-          <w:szCs w:val="18"/>
-        </w:rPr>
-        <w:t xml:space="preserve">    subgraph Web ["Club website (CMS)"]</w:t>
-      </w:r>
-    </w:p>
-    <w:p>
-      <w:pPr>
-        <w:shd w:fill="F5F5F5" w:val="clear"/>
-        <w:spacing w:after="0"/>
-      </w:pPr>
-      <w:r>
-        <w:rPr>
-          <w:rFonts w:ascii="Consolas" w:cs="Consolas" w:eastAsia="Consolas" w:hAnsi="Consolas"/>
-          <w:sz w:val="18"/>
-          <w:szCs w:val="18"/>
-        </w:rPr>
-        <w:t xml:space="preserve">        EMBED["Thin embed block&lt;br/&gt;(calls public JSON endpoint)"]</w:t>
-      </w:r>
-    </w:p>
-    <w:p>
-      <w:pPr>
-        <w:shd w:fill="F5F5F5" w:val="clear"/>
-        <w:spacing w:after="0"/>
-      </w:pPr>
-      <w:r>
-        <w:rPr>
-          <w:rFonts w:ascii="Consolas" w:cs="Consolas" w:eastAsia="Consolas" w:hAnsi="Consolas"/>
-          <w:sz w:val="18"/>
-          <w:szCs w:val="18"/>
-        </w:rPr>
-        <w:t xml:space="preserve">        IFRAME["iframe&lt;br/&gt;(embeds public calendar page)"]</w:t>
-      </w:r>
-    </w:p>
-    <w:p>
-      <w:pPr>
-        <w:shd w:fill="F5F5F5" w:val="clear"/>
-        <w:spacing w:after="0"/>
-      </w:pPr>
-      <w:r>
-        <w:rPr>
-          <w:rFonts w:ascii="Consolas" w:cs="Consolas" w:eastAsia="Consolas" w:hAnsi="Consolas"/>
-          <w:sz w:val="18"/>
-          <w:szCs w:val="18"/>
-        </w:rPr>
-        <w:t xml:space="preserve">    end</w:t>
-      </w:r>
-    </w:p>
-    <w:p>
-      <w:pPr>
-        <w:shd w:fill="F5F5F5" w:val="clear"/>
-        <w:spacing w:after="0"/>
-      </w:pPr>
-      <w:r>
-        <w:rPr>
-          <w:rFonts w:ascii="Consolas" w:cs="Consolas" w:eastAsia="Consolas" w:hAnsi="Consolas"/>
-          <w:sz w:val="18"/>
-          <w:szCs w:val="18"/>
-        </w:rPr>
-        <w:t xml:space="preserve"> </w:t>
-      </w:r>
-    </w:p>
-    <w:p>
-      <w:pPr>
-        <w:shd w:fill="F5F5F5" w:val="clear"/>
-        <w:spacing w:after="0"/>
-      </w:pPr>
-      <w:r>
-        <w:rPr>
-          <w:rFonts w:ascii="Consolas" w:cs="Consolas" w:eastAsia="Consolas" w:hAnsi="Consolas"/>
-          <w:sz w:val="18"/>
-          <w:szCs w:val="18"/>
-        </w:rPr>
-        <w:t xml:space="preserve">    STAFF(("Staff")) --&gt;|"HTTPS + Entra SSO"| UI</w:t>
-      </w:r>
-    </w:p>
-    <w:p>
-      <w:pPr>
-        <w:shd w:fill="F5F5F5" w:val="clear"/>
-        <w:spacing w:after="0"/>
-      </w:pPr>
-      <w:r>
-        <w:rPr>
-          <w:rFonts w:ascii="Consolas" w:cs="Consolas" w:eastAsia="Consolas" w:hAnsi="Consolas"/>
-          <w:sz w:val="18"/>
-          <w:szCs w:val="18"/>
-        </w:rPr>
-        <w:t xml:space="preserve">    MEMBER(("Club members&lt;br/&gt;(anonymous)")) --&gt; IFRAME</w:t>
-      </w:r>
-    </w:p>
-    <w:p>
-      <w:pPr>
-        <w:shd w:fill="F5F5F5" w:val="clear"/>
-        <w:spacing w:after="0"/>
-      </w:pPr>
-      <w:r>
-        <w:rPr>
-          <w:rFonts w:ascii="Consolas" w:cs="Consolas" w:eastAsia="Consolas" w:hAnsi="Consolas"/>
-          <w:sz w:val="18"/>
-          <w:szCs w:val="18"/>
-        </w:rPr>
-        <w:t xml:space="preserve">    ANON(("Public visitors")) --&gt; EMBED</w:t>
-      </w:r>
-    </w:p>
-    <w:p>
-      <w:pPr>
-        <w:shd w:fill="F5F5F5" w:val="clear"/>
-        <w:spacing w:after="0"/>
-      </w:pPr>
-      <w:r>
-        <w:rPr>
-          <w:rFonts w:ascii="Consolas" w:cs="Consolas" w:eastAsia="Consolas" w:hAnsi="Consolas"/>
-          <w:sz w:val="18"/>
-          <w:szCs w:val="18"/>
-        </w:rPr>
-        <w:t xml:space="preserve">    STAFF -.-&gt;|"read-only fallback&lt;br/&gt;(Reviewer permission)"| EXO</w:t>
-      </w:r>
-    </w:p>
-    <w:p>
-      <w:pPr>
-        <w:shd w:fill="F5F5F5" w:val="clear"/>
-        <w:spacing w:after="0"/>
-      </w:pPr>
-      <w:r>
-        <w:rPr>
-          <w:rFonts w:ascii="Consolas" w:cs="Consolas" w:eastAsia="Consolas" w:hAnsi="Consolas"/>
-          <w:sz w:val="18"/>
-          <w:szCs w:val="18"/>
-        </w:rPr>
-        <w:t xml:space="preserve"> </w:t>
-      </w:r>
-    </w:p>
-    <w:p>
-      <w:pPr>
-        <w:shd w:fill="F5F5F5" w:val="clear"/>
-        <w:spacing w:after="0"/>
-      </w:pPr>
-      <w:r>
-        <w:rPr>
-          <w:rFonts w:ascii="Consolas" w:cs="Consolas" w:eastAsia="Consolas" w:hAnsi="Consolas"/>
-          <w:sz w:val="18"/>
-          <w:szCs w:val="18"/>
-        </w:rPr>
-        <w:t xml:space="preserve">    UI --&gt; API</w:t>
-      </w:r>
-    </w:p>
-    <w:p>
-      <w:pPr>
-        <w:shd w:fill="F5F5F5" w:val="clear"/>
-        <w:spacing w:after="0"/>
-      </w:pPr>
-      <w:r>
-        <w:rPr>
-          <w:rFonts w:ascii="Consolas" w:cs="Consolas" w:eastAsia="Consolas" w:hAnsi="Consolas"/>
-          <w:sz w:val="18"/>
-          <w:szCs w:val="18"/>
-        </w:rPr>
-        <w:t xml:space="preserve">    API &lt;--&gt; CACHE</w:t>
-      </w:r>
-    </w:p>
-    <w:p>
-      <w:pPr>
-        <w:shd w:fill="F5F5F5" w:val="clear"/>
-        <w:spacing w:after="0"/>
-      </w:pPr>
-      <w:r>
-        <w:rPr>
-          <w:rFonts w:ascii="Consolas" w:cs="Consolas" w:eastAsia="Consolas" w:hAnsi="Consolas"/>
-          <w:sz w:val="18"/>
-          <w:szCs w:val="18"/>
-        </w:rPr>
-        <w:t xml:space="preserve">    API --&gt;|"Microsoft Graph&lt;br/&gt;(REST/JSON)"| EXO</w:t>
-      </w:r>
-    </w:p>
-    <w:p>
-      <w:pPr>
-        <w:shd w:fill="F5F5F5" w:val="clear"/>
-        <w:spacing w:after="0"/>
-      </w:pPr>
-      <w:r>
-        <w:rPr>
-          <w:rFonts w:ascii="Consolas" w:cs="Consolas" w:eastAsia="Consolas" w:hAnsi="Consolas"/>
-          <w:sz w:val="18"/>
-          <w:szCs w:val="18"/>
-        </w:rPr>
-        <w:t xml:space="preserve">    API &lt;--&gt;|"OAuth 2.0 tokens"| EID</w:t>
-      </w:r>
-    </w:p>
-    <w:p>
-      <w:pPr>
-        <w:shd w:fill="F5F5F5" w:val="clear"/>
-        <w:spacing w:after="0"/>
-      </w:pPr>
-      <w:r>
-        <w:rPr>
-          <w:rFonts w:ascii="Consolas" w:cs="Consolas" w:eastAsia="Consolas" w:hAnsi="Consolas"/>
-          <w:sz w:val="18"/>
-          <w:szCs w:val="18"/>
-        </w:rPr>
-        <w:t xml:space="preserve">    EMBED --&gt; PUBAPI</w:t>
-      </w:r>
-    </w:p>
-    <w:p>
-      <w:pPr>
-        <w:shd w:fill="F5F5F5" w:val="clear"/>
-        <w:spacing w:after="0"/>
-      </w:pPr>
-      <w:r>
-        <w:rPr>
-          <w:rFonts w:ascii="Consolas" w:cs="Consolas" w:eastAsia="Consolas" w:hAnsi="Consolas"/>
-          <w:sz w:val="18"/>
-          <w:szCs w:val="18"/>
-        </w:rPr>
-        <w:t xml:space="preserve">    IFRAME --&gt; PUBCAL</w:t>
-      </w:r>
-    </w:p>
-    <w:p>
-      <w:pPr>
-        <w:shd w:fill="F5F5F5" w:val="clear"/>
-        <w:spacing w:after="0"/>
-      </w:pPr>
-      <w:r>
-        <w:rPr>
-          <w:rFonts w:ascii="Consolas" w:cs="Consolas" w:eastAsia="Consolas" w:hAnsi="Consolas"/>
-          <w:sz w:val="18"/>
-          <w:szCs w:val="18"/>
-        </w:rPr>
-        <w:t xml:space="preserve">    PUBAPI --&gt; API</w:t>
-      </w:r>
-    </w:p>
-    <w:p>
-      <w:pPr>
-        <w:shd w:fill="F5F5F5" w:val="clear"/>
-        <w:spacing w:after="0"/>
-      </w:pPr>
-      <w:r>
-        <w:rPr>
-          <w:rFonts w:ascii="Consolas" w:cs="Consolas" w:eastAsia="Consolas" w:hAnsi="Consolas"/>
-          <w:sz w:val="18"/>
-          <w:szCs w:val="18"/>
-        </w:rPr>
-        <w:t xml:space="preserve">    PUBCAL --&gt; API</w:t>
-      </w:r>
-    </w:p>
-    <w:p>
-      <w:pPr>
-        <w:spacing w:after="160"/>
-      </w:pPr>
+        <w:spacing w:after="200" w:before="120"/>
+        <w:jc w:val="center"/>
+      </w:pPr>
+      <w:r>
+        <w:drawing>
+          <wp:inline distT="0" distB="0" distL="0" distR="0">
+            <wp:extent cx="5943600" cy="4400550"/>
+            <wp:effectExtent t="0" r="0" b="0" l="0"/>
+            <wp:docPr id="1" name="" descr="" title=""/>
+            <wp:cNvGraphicFramePr>
+              <a:graphicFrameLocks xmlns:a="http://schemas.openxmlformats.org/drawingml/2006/main" noChangeAspect="1"/>
+            </wp:cNvGraphicFramePr>
+            <a:graphic xmlns:a="http://schemas.openxmlformats.org/drawingml/2006/main">
+              <a:graphicData uri="http://schemas.openxmlformats.org/drawingml/2006/picture">
+                <pic:pic xmlns:pic="http://schemas.openxmlformats.org/drawingml/2006/picture">
+                  <pic:nvPicPr>
+                    <pic:cNvPr id="0" name="" descr=""/>
+                    <pic:cNvPicPr>
+                      <a:picLocks noChangeAspect="1" noChangeArrowheads="1"/>
+                    </pic:cNvPicPr>
+                  </pic:nvPicPr>
+                  <pic:blipFill>
+                    <a:blip r:embed="rId7" cstate="none"/>
+                    <a:srcRect/>
+                    <a:stretch>
+                      <a:fillRect/>
+                    </a:stretch>
+                  </pic:blipFill>
+                  <pic:spPr bwMode="auto">
+                    <a:xfrm>
+                      <a:off x="0" y="0"/>
+                      <a:ext cx="5943600" cy="4400550"/>
+                    </a:xfrm>
+                    <a:prstGeom prst="rect">
+                      <a:avLst/>
+                    </a:prstGeom>
+                  </pic:spPr>
+                </pic:pic>
+              </a:graphicData>
+            </a:graphic>
+          </wp:inline>
+        </w:drawing>
+      </w:r>
     </w:p>
     <w:p>
       <w:pPr>

</xml_diff>